<commit_message>
Fix Unit 37 SQL: unescaped comma/apostrophe in R5 video labels
The two R5 'Same Perimeter, Different...' labels contained a comma that
left the CSV field unquoted, corrupting SQL generation (split the label
and pushed the unescaped apostrophe in "JoAnn's" into the URL position),
causing a Postgres syntax error. Replaced the comma with an em dash in
the CSV and unit_data, regenerated the SQL with proper CSV parsing and
apostrophe escaping (all 42 rows validated, 7 fields each), and rebuilt
the program docx/pdf + resource appendix to match.

Co-Authored-By: Claude Opus 4.8 <noreply@anthropic.com>
</commit_message>
<xml_diff>
--- a/units/u37/Maths_S3_YearB_Unit37_SOLO_Full_Program.docx
+++ b/units/u37/Maths_S3_YearB_Unit37_SOLO_Full_Program.docx
@@ -21375,7 +21375,7 @@
             <w:pPr>
               <w:spacing w:before="0" w:after="0"/>
             </w:pPr>
-            <w:hyperlink w:history="1" r:id="rIdimdtofkcf6lo5x58mingg">
+            <w:hyperlink w:history="1" r:id="rIdaf8vryrkfikem3lq8al-w">
               <w:r>
                 <w:rPr>
                   <w:u w:val="single"/>
@@ -21492,7 +21492,7 @@
             <w:pPr>
               <w:spacing w:before="0" w:after="0"/>
             </w:pPr>
-            <w:hyperlink w:history="1" r:id="rId_4ry3vhsblp3veq9q539g">
+            <w:hyperlink w:history="1" r:id="rIdd80atl0kxo1-qroxhkdtt">
               <w:r>
                 <w:rPr>
                   <w:u w:val="single"/>
@@ -21609,7 +21609,7 @@
             <w:pPr>
               <w:spacing w:before="0" w:after="0"/>
             </w:pPr>
-            <w:hyperlink w:history="1" r:id="rId6l9r2tinc-bbpceazkoqy">
+            <w:hyperlink w:history="1" r:id="rIdilp7q7atyi6vftm1azbju">
               <w:r>
                 <w:rPr>
                   <w:u w:val="single"/>
@@ -21766,7 +21766,7 @@
             <w:pPr>
               <w:spacing w:before="0" w:after="0"/>
             </w:pPr>
-            <w:hyperlink w:history="1" r:id="rIdtt1kskqrdst0njdctsxu8">
+            <w:hyperlink w:history="1" r:id="rIdgcmsx1pb0ridiei3wypgh">
               <w:r>
                 <w:rPr>
                   <w:u w:val="single"/>
@@ -21883,7 +21883,7 @@
             <w:pPr>
               <w:spacing w:before="0" w:after="0"/>
             </w:pPr>
-            <w:hyperlink w:history="1" r:id="rIdany75vgrhzycxe8qoxqti">
+            <w:hyperlink w:history="1" r:id="rIdwpigpf4i7rynsrbgz6pfd">
               <w:r>
                 <w:rPr>
                   <w:u w:val="single"/>
@@ -22000,7 +22000,7 @@
             <w:pPr>
               <w:spacing w:before="0" w:after="0"/>
             </w:pPr>
-            <w:hyperlink w:history="1" r:id="rId7iojmmh4qhg8wvnlzqge9">
+            <w:hyperlink w:history="1" r:id="rId4pmyt5nbyekah_yzpdtq_">
               <w:r>
                 <w:rPr>
                   <w:u w:val="single"/>
@@ -22157,7 +22157,7 @@
             <w:pPr>
               <w:spacing w:before="0" w:after="0"/>
             </w:pPr>
-            <w:hyperlink w:history="1" r:id="rIdf2iflf-2qvwyilnjnwp49">
+            <w:hyperlink w:history="1" r:id="rIduefq-zgcq_8whxjojfeqz">
               <w:r>
                 <w:rPr>
                   <w:u w:val="single"/>
@@ -22274,7 +22274,7 @@
             <w:pPr>
               <w:spacing w:before="0" w:after="0"/>
             </w:pPr>
-            <w:hyperlink w:history="1" r:id="rIdhpw5asploexpavxhrudgt">
+            <w:hyperlink w:history="1" r:id="rIdjxx19c2qo2fecouuqf1lf">
               <w:r>
                 <w:rPr>
                   <w:u w:val="single"/>
@@ -22391,7 +22391,7 @@
             <w:pPr>
               <w:spacing w:before="0" w:after="0"/>
             </w:pPr>
-            <w:hyperlink w:history="1" r:id="rIdqtjhdzao7vukqzsaaa2_5">
+            <w:hyperlink w:history="1" r:id="rIdojy1wj2wkil40ltmkh4ov">
               <w:r>
                 <w:rPr>
                   <w:u w:val="single"/>
@@ -22548,7 +22548,7 @@
             <w:pPr>
               <w:spacing w:before="0" w:after="0"/>
             </w:pPr>
-            <w:hyperlink w:history="1" r:id="rIdegtnuqck1maw7uv1nin7c">
+            <w:hyperlink w:history="1" r:id="rIdohzdmisoqmkbiwdezukvt">
               <w:r>
                 <w:rPr>
                   <w:u w:val="single"/>
@@ -22665,7 +22665,7 @@
             <w:pPr>
               <w:spacing w:before="0" w:after="0"/>
             </w:pPr>
-            <w:hyperlink w:history="1" r:id="rIdwilau8admiepmwgmbrnre">
+            <w:hyperlink w:history="1" r:id="rId-pvkjkvjsggge6uq7ovre">
               <w:r>
                 <w:rPr>
                   <w:u w:val="single"/>
@@ -22782,7 +22782,7 @@
             <w:pPr>
               <w:spacing w:before="0" w:after="0"/>
             </w:pPr>
-            <w:hyperlink w:history="1" r:id="rIdlgjduadjxwbmfaskfl5qp">
+            <w:hyperlink w:history="1" r:id="rIdbld97xg1ghi00iiaruxuh">
               <w:r>
                 <w:rPr>
                   <w:u w:val="single"/>
@@ -22913,7 +22913,7 @@
                 <w:szCs w:val="14"/>
                 <w:rFonts w:ascii="Arial" w:cs="Arial" w:eastAsia="Arial" w:hAnsi="Arial"/>
               </w:rPr>
-              <w:t xml:space="preserve">Same Perimeter, Different Areas (Grade 3) | MATH-N-ROLL</w:t>
+              <w:t xml:space="preserve">Same Perimeter — Different Areas (Grade 3) | MATH-N-ROLL</w:t>
             </w:r>
           </w:p>
         </w:tc>
@@ -22939,7 +22939,7 @@
             <w:pPr>
               <w:spacing w:before="0" w:after="0"/>
             </w:pPr>
-            <w:hyperlink w:history="1" r:id="rIdqxz5relgmxkcxkays8t94">
+            <w:hyperlink w:history="1" r:id="rIdwjxdfkqyak1rtsom5klsv">
               <w:r>
                 <w:rPr>
                   <w:u w:val="single"/>
@@ -23030,7 +23030,7 @@
                 <w:szCs w:val="14"/>
                 <w:rFonts w:ascii="Arial" w:cs="Arial" w:eastAsia="Arial" w:hAnsi="Arial"/>
               </w:rPr>
-              <w:t xml:space="preserve">Same Perimeter, Different Area (Grade 3 Math) | JoAnn's School</w:t>
+              <w:t xml:space="preserve">Same Perimeter — Different Area (Grade 3 Math) | JoAnn's School</w:t>
             </w:r>
           </w:p>
         </w:tc>
@@ -23056,7 +23056,7 @@
             <w:pPr>
               <w:spacing w:before="0" w:after="0"/>
             </w:pPr>
-            <w:hyperlink w:history="1" r:id="rIdrhhkcgqhb5s4nc1bzo3w5">
+            <w:hyperlink w:history="1" r:id="rId-qtlv59zxbn2auvfe8eek">
               <w:r>
                 <w:rPr>
                   <w:u w:val="single"/>
@@ -23173,7 +23173,7 @@
             <w:pPr>
               <w:spacing w:before="0" w:after="0"/>
             </w:pPr>
-            <w:hyperlink w:history="1" r:id="rIdfpcio0n3y9baj1dyufhlo">
+            <w:hyperlink w:history="1" r:id="rIdpmiuaxomi-5x8fierucef">
               <w:r>
                 <w:rPr>
                   <w:u w:val="single"/>
@@ -23330,7 +23330,7 @@
             <w:pPr>
               <w:spacing w:before="0" w:after="0"/>
             </w:pPr>
-            <w:hyperlink w:history="1" r:id="rIdfncbklvsdqssrjigtn1ts">
+            <w:hyperlink w:history="1" r:id="rIdnz5txxjoebpigx9d94qta">
               <w:r>
                 <w:rPr>
                   <w:u w:val="single"/>
@@ -23447,7 +23447,7 @@
             <w:pPr>
               <w:spacing w:before="0" w:after="0"/>
             </w:pPr>
-            <w:hyperlink w:history="1" r:id="rIder7weymofr0n16a26ac3x">
+            <w:hyperlink w:history="1" r:id="rIdhxwe6_rnjplzldw9wn-1p">
               <w:r>
                 <w:rPr>
                   <w:u w:val="single"/>
@@ -23564,7 +23564,7 @@
             <w:pPr>
               <w:spacing w:before="0" w:after="0"/>
             </w:pPr>
-            <w:hyperlink w:history="1" r:id="rIdundbfqikdiya-yeflwim-">
+            <w:hyperlink w:history="1" r:id="rIdxoab2cgtfdakd1qh_wp4f">
               <w:r>
                 <w:rPr>
                   <w:u w:val="single"/>
@@ -23721,7 +23721,7 @@
             <w:pPr>
               <w:spacing w:before="0" w:after="0"/>
             </w:pPr>
-            <w:hyperlink w:history="1" r:id="rIdkma6r2ggirki3ovqt1_qx">
+            <w:hyperlink w:history="1" r:id="rIde5qwz6-aqri-5s09w_ezr">
               <w:r>
                 <w:rPr>
                   <w:u w:val="single"/>
@@ -23838,7 +23838,7 @@
             <w:pPr>
               <w:spacing w:before="0" w:after="0"/>
             </w:pPr>
-            <w:hyperlink w:history="1" r:id="rId2iw3duhpiebecu1tyuf_d">
+            <w:hyperlink w:history="1" r:id="rIddodde1ptejjtuuh-oowxu">
               <w:r>
                 <w:rPr>
                   <w:u w:val="single"/>
@@ -23955,7 +23955,7 @@
             <w:pPr>
               <w:spacing w:before="0" w:after="0"/>
             </w:pPr>
-            <w:hyperlink w:history="1" r:id="rIdkki-bjc8zvxlyxql-zwnq">
+            <w:hyperlink w:history="1" r:id="rIdvbyhp7uno_jza73eqtokx">
               <w:r>
                 <w:rPr>
                   <w:u w:val="single"/>
@@ -24112,7 +24112,7 @@
             <w:pPr>
               <w:spacing w:before="0" w:after="0"/>
             </w:pPr>
-            <w:hyperlink w:history="1" r:id="rId3c3wqhw8n_qubctkse63f">
+            <w:hyperlink w:history="1" r:id="rIdk4nfaclvegp0ygpuwxzxq">
               <w:r>
                 <w:rPr>
                   <w:u w:val="single"/>
@@ -24229,7 +24229,7 @@
             <w:pPr>
               <w:spacing w:before="0" w:after="0"/>
             </w:pPr>
-            <w:hyperlink w:history="1" r:id="rId5zsdjoorf1whc73uz_wxz">
+            <w:hyperlink w:history="1" r:id="rIds4iqwyxzyz48oi2makmk2">
               <w:r>
                 <w:rPr>
                   <w:u w:val="single"/>
@@ -24346,7 +24346,7 @@
             <w:pPr>
               <w:spacing w:before="0" w:after="0"/>
             </w:pPr>
-            <w:hyperlink w:history="1" r:id="rId7kavgs-vrvzm47-18yxyo">
+            <w:hyperlink w:history="1" r:id="rIdlwt7ilyueet7rli-s_tq4">
               <w:r>
                 <w:rPr>
                   <w:u w:val="single"/>
@@ -24503,7 +24503,7 @@
             <w:pPr>
               <w:spacing w:before="0" w:after="0"/>
             </w:pPr>
-            <w:hyperlink w:history="1" r:id="rIdrvcpremndb8zuqk8m-t3x">
+            <w:hyperlink w:history="1" r:id="rIdxvj0rxmmu4vqhjelh0yg9">
               <w:r>
                 <w:rPr>
                   <w:u w:val="single"/>
@@ -24620,7 +24620,7 @@
             <w:pPr>
               <w:spacing w:before="0" w:after="0"/>
             </w:pPr>
-            <w:hyperlink w:history="1" r:id="rIdjkzj8_rlswtetebr1ns7b">
+            <w:hyperlink w:history="1" r:id="rId_50lsg_gt0bwiydso40dr">
               <w:r>
                 <w:rPr>
                   <w:u w:val="single"/>
@@ -24737,7 +24737,7 @@
             <w:pPr>
               <w:spacing w:before="0" w:after="0"/>
             </w:pPr>
-            <w:hyperlink w:history="1" r:id="rId1o6xh5ekxfabdk7xpiuhc">
+            <w:hyperlink w:history="1" r:id="rIdwxjxf7rlm2p9bzp9ntodn">
               <w:r>
                 <w:rPr>
                   <w:u w:val="single"/>
@@ -24894,7 +24894,7 @@
             <w:pPr>
               <w:spacing w:before="0" w:after="0"/>
             </w:pPr>
-            <w:hyperlink w:history="1" r:id="rIdxidv39lxz0biaovgfc4op">
+            <w:hyperlink w:history="1" r:id="rIdsp1585gfczt_qb-6g8xrr">
               <w:r>
                 <w:rPr>
                   <w:u w:val="single"/>
@@ -25011,7 +25011,7 @@
             <w:pPr>
               <w:spacing w:before="0" w:after="0"/>
             </w:pPr>
-            <w:hyperlink w:history="1" r:id="rIdqg2t_7jbp1rxvsbso2ws8">
+            <w:hyperlink w:history="1" r:id="rIdrlo6mozbij75ocafswj2h">
               <w:r>
                 <w:rPr>
                   <w:u w:val="single"/>
@@ -25128,7 +25128,7 @@
             <w:pPr>
               <w:spacing w:before="0" w:after="0"/>
             </w:pPr>
-            <w:hyperlink w:history="1" r:id="rId_lzk6chz2l9v82dzf3xfk">
+            <w:hyperlink w:history="1" r:id="rIdissqkgic_2mtcmhuimdnm">
               <w:r>
                 <w:rPr>
                   <w:u w:val="single"/>
@@ -25285,7 +25285,7 @@
             <w:pPr>
               <w:spacing w:before="0" w:after="0"/>
             </w:pPr>
-            <w:hyperlink w:history="1" r:id="rIddxy3uvemr9ibjtc7gbmuu">
+            <w:hyperlink w:history="1" r:id="rId-hnydijhr1-up02trpuwu">
               <w:r>
                 <w:rPr>
                   <w:u w:val="single"/>
@@ -25402,7 +25402,7 @@
             <w:pPr>
               <w:spacing w:before="0" w:after="0"/>
             </w:pPr>
-            <w:hyperlink w:history="1" r:id="rId8we7mriv3wmtqumy0f3p_">
+            <w:hyperlink w:history="1" r:id="rIdphmhlkj_wtv18dqt_sp5a">
               <w:r>
                 <w:rPr>
                   <w:u w:val="single"/>
@@ -25519,7 +25519,7 @@
             <w:pPr>
               <w:spacing w:before="0" w:after="0"/>
             </w:pPr>
-            <w:hyperlink w:history="1" r:id="rIdilcyoffyexcjmxwzryzur">
+            <w:hyperlink w:history="1" r:id="rId7zad1hpbdz7oyyecsdxss">
               <w:r>
                 <w:rPr>
                   <w:u w:val="single"/>
@@ -25676,7 +25676,7 @@
             <w:pPr>
               <w:spacing w:before="0" w:after="0"/>
             </w:pPr>
-            <w:hyperlink w:history="1" r:id="rIdeqd8qfqmmzpvdslu3u8ud">
+            <w:hyperlink w:history="1" r:id="rIdjljqp1h_-2kslavhfalxw">
               <w:r>
                 <w:rPr>
                   <w:u w:val="single"/>
@@ -25793,7 +25793,7 @@
             <w:pPr>
               <w:spacing w:before="0" w:after="0"/>
             </w:pPr>
-            <w:hyperlink w:history="1" r:id="rIdfktclns_v4oi9psaw4a2b">
+            <w:hyperlink w:history="1" r:id="rIdmn8dfy4chvza7yhjko1g0">
               <w:r>
                 <w:rPr>
                   <w:u w:val="single"/>
@@ -25910,7 +25910,7 @@
             <w:pPr>
               <w:spacing w:before="0" w:after="0"/>
             </w:pPr>
-            <w:hyperlink w:history="1" r:id="rId6db7yuoxojfwyf2lhu814">
+            <w:hyperlink w:history="1" r:id="rIdyq45cd9khebxeqf7jbw8_">
               <w:r>
                 <w:rPr>
                   <w:u w:val="single"/>
@@ -26067,7 +26067,7 @@
             <w:pPr>
               <w:spacing w:before="0" w:after="0"/>
             </w:pPr>
-            <w:hyperlink w:history="1" r:id="rId_5srew3znb0clz_pnindd">
+            <w:hyperlink w:history="1" r:id="rIdkkupcvzt6jh9b7mdrpgtf">
               <w:r>
                 <w:rPr>
                   <w:u w:val="single"/>
@@ -26184,7 +26184,7 @@
             <w:pPr>
               <w:spacing w:before="0" w:after="0"/>
             </w:pPr>
-            <w:hyperlink w:history="1" r:id="rIdowasfjdha-corjry095hc">
+            <w:hyperlink w:history="1" r:id="rIdzchb_thkeutyb6mya0uwv">
               <w:r>
                 <w:rPr>
                   <w:u w:val="single"/>
@@ -26301,7 +26301,7 @@
             <w:pPr>
               <w:spacing w:before="0" w:after="0"/>
             </w:pPr>
-            <w:hyperlink w:history="1" r:id="rIdxzts8pqxwshj7kru3mb5c">
+            <w:hyperlink w:history="1" r:id="rId1r2e5x9vdmn0zlbvbvuo0">
               <w:r>
                 <w:rPr>
                   <w:u w:val="single"/>
@@ -26458,7 +26458,7 @@
             <w:pPr>
               <w:spacing w:before="0" w:after="0"/>
             </w:pPr>
-            <w:hyperlink w:history="1" r:id="rIdogqpamkzmey4gsxh3dmno">
+            <w:hyperlink w:history="1" r:id="rIdkl43xgl-tff4chbdbxqrt">
               <w:r>
                 <w:rPr>
                   <w:u w:val="single"/>
@@ -26575,7 +26575,7 @@
             <w:pPr>
               <w:spacing w:before="0" w:after="0"/>
             </w:pPr>
-            <w:hyperlink w:history="1" r:id="rId4rdpoiwrbwtbkixozuanc">
+            <w:hyperlink w:history="1" r:id="rId24qagfsaniiez_fptjyj9">
               <w:r>
                 <w:rPr>
                   <w:u w:val="single"/>
@@ -26692,7 +26692,7 @@
             <w:pPr>
               <w:spacing w:before="0" w:after="0"/>
             </w:pPr>
-            <w:hyperlink w:history="1" r:id="rIdct2e9tzgivnkkzmv_thsg">
+            <w:hyperlink w:history="1" r:id="rIdkfyutsvzmshzcxlrdjj3h">
               <w:r>
                 <w:rPr>
                   <w:u w:val="single"/>
@@ -26849,7 +26849,7 @@
             <w:pPr>
               <w:spacing w:before="0" w:after="0"/>
             </w:pPr>
-            <w:hyperlink w:history="1" r:id="rIdmplfdyujzr0gvjp8f7x8b">
+            <w:hyperlink w:history="1" r:id="rIdeq98k-nhejtm9izg6m3iv">
               <w:r>
                 <w:rPr>
                   <w:u w:val="single"/>
@@ -26966,7 +26966,7 @@
             <w:pPr>
               <w:spacing w:before="0" w:after="0"/>
             </w:pPr>
-            <w:hyperlink w:history="1" r:id="rIdv1mfiorcndjbl2c-fou4z">
+            <w:hyperlink w:history="1" r:id="rIdqu0sb-7fcfvpx_66xmkr7">
               <w:r>
                 <w:rPr>
                   <w:u w:val="single"/>
@@ -27083,7 +27083,7 @@
             <w:pPr>
               <w:spacing w:before="0" w:after="0"/>
             </w:pPr>
-            <w:hyperlink w:history="1" r:id="rIdmx9y3du6rcisu3wz9fh2h">
+            <w:hyperlink w:history="1" r:id="rIde4ncxtbcxsm198ws_b1ws">
               <w:r>
                 <w:rPr>
                   <w:u w:val="single"/>
@@ -27200,7 +27200,7 @@
             <w:pPr>
               <w:spacing w:before="0" w:after="0"/>
             </w:pPr>
-            <w:hyperlink w:history="1" r:id="rId3g6y-x81jbnjjx8nszfbb">
+            <w:hyperlink w:history="1" r:id="rIda3ua6piqng8l0iy9mm310">
               <w:r>
                 <w:rPr>
                   <w:u w:val="single"/>
@@ -27317,7 +27317,7 @@
             <w:pPr>
               <w:spacing w:before="0" w:after="0"/>
             </w:pPr>
-            <w:hyperlink w:history="1" r:id="rIdupqe93gs9hsa8daekjot5">
+            <w:hyperlink w:history="1" r:id="rId2ead5zgiclvsxqdwhj1tm">
               <w:r>
                 <w:rPr>
                   <w:u w:val="single"/>
@@ -27392,7 +27392,7 @@
         </w:rPr>
         <w:t xml:space="preserve">Corbettmaths — Factors (PDF)  --  </w:t>
       </w:r>
-      <w:hyperlink w:history="1" r:id="rIdbz3yn6pw7nj7paygswz7t">
+      <w:hyperlink w:history="1" r:id="rIdci0qy2queddgpo5kptdtv">
         <w:r>
           <w:rPr>
             <w:u w:val="single"/>
@@ -27426,7 +27426,7 @@
         </w:rPr>
         <w:t xml:space="preserve">Corbettmaths — Prime Numbers (PDF)  --  </w:t>
       </w:r>
-      <w:hyperlink w:history="1" r:id="rId59uysargdxtftbx3fijeq">
+      <w:hyperlink w:history="1" r:id="rId4wq0zp6t-ae7aro5arybk">
         <w:r>
           <w:rPr>
             <w:u w:val="single"/>
@@ -27460,7 +27460,7 @@
         </w:rPr>
         <w:t xml:space="preserve">Corbettmaths — Multiplication (PDF)  --  </w:t>
       </w:r>
-      <w:hyperlink w:history="1" r:id="rIdzonvkr6ckfwxpxylupqf-">
+      <w:hyperlink w:history="1" r:id="rIdiro_4tu4nnkt0cjj2yxih">
         <w:r>
           <w:rPr>
             <w:u w:val="single"/>
@@ -27494,7 +27494,7 @@
         </w:rPr>
         <w:t xml:space="preserve">Corbettmaths — Area of a Rectangle (PDF)  --  </w:t>
       </w:r>
-      <w:hyperlink w:history="1" r:id="rIduhhtesvkdk___4k5zohgg">
+      <w:hyperlink w:history="1" r:id="rIddbefppkvcfea_ch3bbek9">
         <w:r>
           <w:rPr>
             <w:u w:val="single"/>
@@ -27528,7 +27528,7 @@
         </w:rPr>
         <w:t xml:space="preserve">Corbettmaths — Area of Rectangles (PDF)  --  </w:t>
       </w:r>
-      <w:hyperlink w:history="1" r:id="rIdo2fw89sh3bbharhwlg064">
+      <w:hyperlink w:history="1" r:id="rId307asjvklqh7n3v-pihem">
         <w:r>
           <w:rPr>
             <w:u w:val="single"/>
@@ -27562,7 +27562,7 @@
         </w:rPr>
         <w:t xml:space="preserve">Corbettmaths — Volume of a Cuboid (PDF)  --  </w:t>
       </w:r>
-      <w:hyperlink w:history="1" r:id="rId31o2chnh0c7dtpxmgoxre">
+      <w:hyperlink w:history="1" r:id="rIdfyn4rbdszrg9ey6nfzivd">
         <w:r>
           <w:rPr>
             <w:u w:val="single"/>
@@ -27596,7 +27596,7 @@
         </w:rPr>
         <w:t xml:space="preserve">Corbettmaths — Area of a Parallelogram (PDF)  --  </w:t>
       </w:r>
-      <w:hyperlink w:history="1" r:id="rId1taisb8yraugevpl3eoeh">
+      <w:hyperlink w:history="1" r:id="rIdbttzzx70fkbaz8qguxglk">
         <w:r>
           <w:rPr>
             <w:u w:val="single"/>
@@ -27630,7 +27630,7 @@
         </w:rPr>
         <w:t xml:space="preserve">Corbettmaths — Area of a Triangle (PDF)  --  </w:t>
       </w:r>
-      <w:hyperlink w:history="1" r:id="rIdt0hzggu6r73f9_qze5o_g">
+      <w:hyperlink w:history="1" r:id="rIds9c1khcmxywopveftubi0">
         <w:r>
           <w:rPr>
             <w:u w:val="single"/>
@@ -27664,7 +27664,7 @@
         </w:rPr>
         <w:t xml:space="preserve">Corbettmaths — Area of Compound Shapes (PDF)  --  </w:t>
       </w:r>
-      <w:hyperlink w:history="1" r:id="rIdygpbmccej_lnsbnyqwf-q">
+      <w:hyperlink w:history="1" r:id="rIdzja3zl_6wbuwlf72679vl">
         <w:r>
           <w:rPr>
             <w:u w:val="single"/>
@@ -27698,7 +27698,7 @@
         </w:rPr>
         <w:t xml:space="preserve">Corbettmaths — Volume of a Prism (PDF)  --  </w:t>
       </w:r>
-      <w:hyperlink w:history="1" r:id="rIdauhpltcnrzgbxnzo5h-cq">
+      <w:hyperlink w:history="1" r:id="rIdgevohyyvdnrgdiah2cci4">
         <w:r>
           <w:rPr>
             <w:u w:val="single"/>
@@ -27732,7 +27732,7 @@
         </w:rPr>
         <w:t xml:space="preserve">Corbettmaths — Product of Primes (PDF)  --  </w:t>
       </w:r>
-      <w:hyperlink w:history="1" r:id="rIdpsnv5ggqlpx1rbrvdx0fe">
+      <w:hyperlink w:history="1" r:id="rIdoejco8d94srgovvvrfny9">
         <w:r>
           <w:rPr>
             <w:u w:val="single"/>

</xml_diff>